<commit_message>
2.3: Homojen-heterojen denge ve Kc buyuklugu icin tanecik cizimleri (Gorsel C, D) eklendi; giris paragrafina cift gorsel (Shutter 2424671695, 2837203477) kondu
</commit_message>
<xml_diff>
--- a/Kim11-2-3-Denge-Sabiti.docx
+++ b/Kim11-2-3-Denge-Sabiti.docx
@@ -36,9 +36,213 @@
           <w:rFonts w:ascii="Times New Roman" w:hAnsi="Times New Roman" w:cs="Times New Roman"/>
           <w:lang w:val="tr-TR"/>
         </w:rPr>
-        <w:t>Bir pastacı aynı tarifi kullanarak bazen küçük bazen büyük bir pasta yapsa da malzemelerin birbirine oranı değişmez. Kimyasal dengede de benzer bir düzen vardır. Aynı sıcaklıkta bir tersinir tepkime farklı başlangıç miktarlarıyla başlatıldığında dengedeki derişimler birbirinden farklı olabilir. Peki bu farklı denge derişimleri arasında değişmeyen bir ilişki var mıdır? Bu sorunun cevabını bir etkinlik yaparak keşfediniz. Analiz ve Keşif Atölyesi 2.3.’te tümevarımsal akıl yürüteceksiniz: Farklı deneylerde ölçülen denge derişimlerinde tekrar eden örüntüyü bulacak, bu örüntüyü matematiksel bir modelle ifade edecek ve modelinizi homojen ve heterojen dengeleri kapsayacak şekilde genelleyeceksiniz. Modelinizi bilimsel genellemelerle karşılaştırırken eleştirel bir bakış açısı kullanmanız, araştırmacı bir tutumla çalışkanlık değerinizi geliştirmenize de katkı sağlayacaktır.</w:t>
+        <w:t>Bir pastacı aynı tarifi kullanarak bazen küçük bazen büyük bir pasta yapsa da malzemelerin birbirine oranı değişmez (Görsel A ve Görsel B). Kimyasal dengede de benzer bir düzen vardır. Aynı sıcaklıkta bir tersinir tepkime farklı başlangıç miktarlarıyla başlatıldığında dengedeki derişimler birbirinden farklı olabilir. Peki bu farklı denge derişimleri arasında değişmeyen bir ilişki var mıdır? Bu sorunun cevabını bir etkinlik yaparak keşfediniz. Analiz ve Keşif Atölyesi 2.3.’te tümevarımsal akıl yürüteceksiniz: Farklı deneylerde ölçülen denge derişimlerinde tekrar eden örüntüyü bulacak, bu örüntüyü matematiksel bir modelle ifade edecek ve modelinizi homojen ve heterojen dengeleri kapsayacak şekilde genelleyeceksiniz. Modelinizi bilimsel genellemelerle karşılaştırırken eleştirel bir bakış açısı kullanmanız, araştırmacı bir tutumla çalışkanlık değerinizi geliştirmenize de katkı sağlayacaktır.</w:t>
       </w:r>
     </w:p>
+    <w:tbl>
+      <w:tblPr>
+        <w:tblW w:type="auto" w:w="0"/>
+        <w:tblLook w:firstColumn="1" w:firstRow="1" w:lastColumn="0" w:lastRow="0" w:noHBand="0" w:noVBand="1" w:val="04A0"/>
+        <w:tblBorders>
+          <w:top w:val="nil"/>
+          <w:left w:val="nil"/>
+          <w:bottom w:val="nil"/>
+          <w:right w:val="nil"/>
+          <w:insideH w:val="nil"/>
+          <w:insideV w:val="nil"/>
+        </w:tblBorders>
+        <w:jc w:val="center"/>
+      </w:tblPr>
+      <w:tblGrid>
+        <w:gridCol w:w="4680"/>
+        <w:gridCol w:w="4680"/>
+      </w:tblGrid>
+      <w:tr>
+        <w:tc>
+          <w:tcPr>
+            <w:tcW w:type="dxa" w:w="4680"/>
+          </w:tcPr>
+          <w:p>
+            <w:pPr>
+              <w:jc w:val="center"/>
+            </w:pPr>
+            <w:r>
+              <w:drawing>
+                <wp:inline xmlns:a="http://schemas.openxmlformats.org/drawingml/2006/main" xmlns:pic="http://schemas.openxmlformats.org/drawingml/2006/picture">
+                  <wp:extent cx="3240000" cy="2160000"/>
+                  <wp:docPr id="910014" name="Picture 910014"/>
+                  <wp:cNvGraphicFramePr>
+                    <a:graphicFrameLocks noChangeAspect="1"/>
+                  </wp:cNvGraphicFramePr>
+                  <a:graphic>
+                    <a:graphicData uri="http://schemas.openxmlformats.org/drawingml/2006/picture">
+                      <pic:pic>
+                        <pic:nvPicPr>
+                          <pic:cNvPr id="0" name="k11_23_giris_A.png"/>
+                          <pic:cNvPicPr/>
+                        </pic:nvPicPr>
+                        <pic:blipFill>
+                          <a:blip r:embed="rId14"/>
+                          <a:stretch>
+                            <a:fillRect/>
+                          </a:stretch>
+                        </pic:blipFill>
+                        <pic:spPr>
+                          <a:xfrm>
+                            <a:off x="0" y="0"/>
+                            <a:ext cx="3240000" cy="2160000"/>
+                          </a:xfrm>
+                          <a:prstGeom prst="rect"/>
+                        </pic:spPr>
+                      </pic:pic>
+                    </a:graphicData>
+                  </a:graphic>
+                </wp:inline>
+              </w:drawing>
+            </w:r>
+          </w:p>
+        </w:tc>
+        <w:tc>
+          <w:tcPr>
+            <w:tcW w:type="dxa" w:w="4680"/>
+          </w:tcPr>
+          <w:p>
+            <w:pPr>
+              <w:jc w:val="center"/>
+            </w:pPr>
+            <w:r>
+              <w:drawing>
+                <wp:inline xmlns:a="http://schemas.openxmlformats.org/drawingml/2006/main" xmlns:pic="http://schemas.openxmlformats.org/drawingml/2006/picture">
+                  <wp:extent cx="1440000" cy="2160000"/>
+                  <wp:docPr id="910015" name="Picture 910015"/>
+                  <wp:cNvGraphicFramePr>
+                    <a:graphicFrameLocks noChangeAspect="1"/>
+                  </wp:cNvGraphicFramePr>
+                  <a:graphic>
+                    <a:graphicData uri="http://schemas.openxmlformats.org/drawingml/2006/picture">
+                      <pic:pic>
+                        <pic:nvPicPr>
+                          <pic:cNvPr id="0" name="k11_23_giris_B.png"/>
+                          <pic:cNvPicPr/>
+                        </pic:nvPicPr>
+                        <pic:blipFill>
+                          <a:blip r:embed="rId15"/>
+                          <a:stretch>
+                            <a:fillRect/>
+                          </a:stretch>
+                        </pic:blipFill>
+                        <pic:spPr>
+                          <a:xfrm>
+                            <a:off x="0" y="0"/>
+                            <a:ext cx="1440000" cy="2160000"/>
+                          </a:xfrm>
+                          <a:prstGeom prst="rect"/>
+                        </pic:spPr>
+                      </pic:pic>
+                    </a:graphicData>
+                  </a:graphic>
+                </wp:inline>
+              </w:drawing>
+            </w:r>
+          </w:p>
+        </w:tc>
+      </w:tr>
+      <w:tr>
+        <w:tc>
+          <w:tcPr>
+            <w:tcW w:type="dxa" w:w="4680"/>
+          </w:tcPr>
+          <w:p>
+            <w:pPr>
+              <w:jc w:val="center"/>
+            </w:pPr>
+            <w:r>
+              <w:rPr>
+                <w:rFonts w:ascii="Times New Roman" w:hAnsi="Times New Roman" w:cs="Times New Roman"/>
+                <w:b/>
+                <w:highlight w:val="yellow"/>
+                <w:lang w:val="tr-TR"/>
+              </w:rPr>
+              <w:t>Shutter id: 2424671695</w:t>
+            </w:r>
+          </w:p>
+        </w:tc>
+        <w:tc>
+          <w:tcPr>
+            <w:tcW w:type="dxa" w:w="4680"/>
+          </w:tcPr>
+          <w:p>
+            <w:pPr>
+              <w:jc w:val="center"/>
+            </w:pPr>
+            <w:r>
+              <w:rPr>
+                <w:rFonts w:ascii="Times New Roman" w:hAnsi="Times New Roman" w:cs="Times New Roman"/>
+                <w:b/>
+                <w:highlight w:val="yellow"/>
+                <w:lang w:val="tr-TR"/>
+              </w:rPr>
+              <w:t>Shutter id: 2837203477</w:t>
+            </w:r>
+          </w:p>
+        </w:tc>
+      </w:tr>
+      <w:tr>
+        <w:tc>
+          <w:tcPr>
+            <w:tcW w:type="dxa" w:w="4680"/>
+          </w:tcPr>
+          <w:p>
+            <w:pPr>
+              <w:jc w:val="center"/>
+            </w:pPr>
+            <w:r>
+              <w:rPr>
+                <w:rFonts w:ascii="Times New Roman" w:hAnsi="Times New Roman" w:cs="Times New Roman"/>
+                <w:b/>
+                <w:lang w:val="tr-TR"/>
+              </w:rPr>
+              <w:t>Görsel A:</w:t>
+            </w:r>
+            <w:r>
+              <w:rPr>
+                <w:rFonts w:ascii="Times New Roman" w:hAnsi="Times New Roman" w:cs="Times New Roman"/>
+                <w:b w:val="0"/>
+                <w:lang w:val="tr-TR"/>
+              </w:rPr>
+              <w:t xml:space="preserve"> Tarifteki malzemelerin tartılması</w:t>
+            </w:r>
+          </w:p>
+        </w:tc>
+        <w:tc>
+          <w:tcPr>
+            <w:tcW w:type="dxa" w:w="4680"/>
+          </w:tcPr>
+          <w:p>
+            <w:pPr>
+              <w:jc w:val="center"/>
+            </w:pPr>
+            <w:r>
+              <w:rPr>
+                <w:rFonts w:ascii="Times New Roman" w:hAnsi="Times New Roman" w:cs="Times New Roman"/>
+                <w:b/>
+                <w:lang w:val="tr-TR"/>
+              </w:rPr>
+              <w:t>Görsel B:</w:t>
+            </w:r>
+            <w:r>
+              <w:rPr>
+                <w:rFonts w:ascii="Times New Roman" w:hAnsi="Times New Roman" w:cs="Times New Roman"/>
+                <w:b w:val="0"/>
+                <w:lang w:val="tr-TR"/>
+              </w:rPr>
+              <w:t xml:space="preserve"> Aynı tarifle hazırlanan büyük ve küçük kekler</w:t>
+            </w:r>
+          </w:p>
+        </w:tc>
+      </w:tr>
+    </w:tbl>
+    <w:p/>
     <w:p>
       <w:pPr>
         <w:keepNext/>
@@ -3496,7 +3700,7 @@
           <w:rFonts w:ascii="Times New Roman" w:hAnsi="Times New Roman" w:cs="Times New Roman"/>
           <w:lang w:val="tr-TR"/>
         </w:rPr>
-        <w:t>(g) dengesi ise heterojendir. Sıcaklık sabit kaldığı sürece saf katıların ve saf sıvıların derişimleri değişmediğinden bu maddeler denge sabiti ifadesinde yer almaz. Buna göre demir(III) oksit dengesi için K</w:t>
+        <w:t>(g) dengesi ise heterojendir (Görsel C). Sıcaklık sabit kaldığı sürece saf katıların ve saf sıvıların derişimleri değişmediğinden bu maddeler denge sabiti ifadesinde yer almaz. Buna göre demir(III) oksit dengesi için K</w:t>
       </w:r>
       <w:r>
         <w:rPr>
@@ -3561,6 +3765,66 @@
     </w:p>
     <w:p>
       <w:pPr>
+        <w:jc w:val="center"/>
+      </w:pPr>
+      <w:r>
+        <w:drawing>
+          <wp:inline xmlns:a="http://schemas.openxmlformats.org/drawingml/2006/main" xmlns:pic="http://schemas.openxmlformats.org/drawingml/2006/picture">
+            <wp:extent cx="5400000" cy="2664935"/>
+            <wp:docPr id="910013" name="Picture 910013"/>
+            <wp:cNvGraphicFramePr>
+              <a:graphicFrameLocks noChangeAspect="1"/>
+            </wp:cNvGraphicFramePr>
+            <a:graphic>
+              <a:graphicData uri="http://schemas.openxmlformats.org/drawingml/2006/picture">
+                <pic:pic>
+                  <pic:nvPicPr>
+                    <pic:cNvPr id="0" name="k11_23_homojen_heterojen.png"/>
+                    <pic:cNvPicPr/>
+                  </pic:nvPicPr>
+                  <pic:blipFill>
+                    <a:blip r:embed="rId13"/>
+                    <a:stretch>
+                      <a:fillRect/>
+                    </a:stretch>
+                  </pic:blipFill>
+                  <pic:spPr>
+                    <a:xfrm>
+                      <a:off x="0" y="0"/>
+                      <a:ext cx="5400000" cy="2664935"/>
+                    </a:xfrm>
+                    <a:prstGeom prst="rect"/>
+                  </pic:spPr>
+                </pic:pic>
+              </a:graphicData>
+            </a:graphic>
+          </wp:inline>
+        </w:drawing>
+      </w:r>
+    </w:p>
+    <w:p>
+      <w:pPr>
+        <w:jc w:val="center"/>
+      </w:pPr>
+      <w:r>
+        <w:rPr>
+          <w:rFonts w:ascii="Times New Roman" w:hAnsi="Times New Roman" w:cs="Times New Roman"/>
+          <w:b/>
+          <w:lang w:val="tr-TR"/>
+        </w:rPr>
+        <w:t>Görsel C:</w:t>
+      </w:r>
+      <w:r>
+        <w:rPr>
+          <w:rFonts w:ascii="Times New Roman" w:hAnsi="Times New Roman" w:cs="Times New Roman"/>
+          <w:b w:val="0"/>
+          <w:lang w:val="tr-TR"/>
+        </w:rPr>
+        <w:t xml:space="preserve"> Homojen ve heterojen denge örneklerinin tanecik gösterimi</w:t>
+      </w:r>
+    </w:p>
+    <w:p>
+      <w:pPr>
         <w:jc w:val="both"/>
         <w:rPr>
           <w:rFonts w:ascii="Times New Roman" w:hAnsi="Times New Roman" w:cs="Times New Roman"/>
@@ -3587,7 +3851,7 @@
           <w:rFonts w:ascii="Times New Roman" w:hAnsi="Times New Roman" w:cs="Times New Roman"/>
           <w:lang w:val="tr-TR"/>
         </w:rPr>
-        <w:t xml:space="preserve"> değeri 1’den çok büyükse dengede ürünler, 1’den çok küçükse tepkenler baskındır; denge sabitinin büyüklüğü dengenin hangi tarafa doğru olduğu hakkında bilgi verir. Bir tepkimenin tersi yazıldığında denge ifadesinde pay ile payda yer değiştirdiğinden yeni denge sabiti 1/K</w:t>
+        <w:t xml:space="preserve"> değeri 1’den çok büyükse dengede ürünler, 1’den çok küçükse tepkenler baskındır; denge sabitinin büyüklüğü dengenin hangi tarafa doğru olduğu hakkında bilgi verir (Görsel D). Bir tepkimenin tersi yazıldığında denge ifadesinde pay ile payda yer değiştirdiğinden yeni denge sabiti 1/K</w:t>
       </w:r>
       <w:r>
         <w:rPr>
@@ -3626,6 +3890,66 @@
           <w:lang w:val="tr-TR"/>
         </w:rPr>
         <w:t xml:space="preserve"> olur.</w:t>
+      </w:r>
+    </w:p>
+    <w:p>
+      <w:pPr>
+        <w:jc w:val="center"/>
+      </w:pPr>
+      <w:r>
+        <w:drawing>
+          <wp:inline xmlns:a="http://schemas.openxmlformats.org/drawingml/2006/main" xmlns:pic="http://schemas.openxmlformats.org/drawingml/2006/picture">
+            <wp:extent cx="5400000" cy="2518577"/>
+            <wp:docPr id="910012" name="Picture 910012"/>
+            <wp:cNvGraphicFramePr>
+              <a:graphicFrameLocks noChangeAspect="1"/>
+            </wp:cNvGraphicFramePr>
+            <a:graphic>
+              <a:graphicData uri="http://schemas.openxmlformats.org/drawingml/2006/picture">
+                <pic:pic>
+                  <pic:nvPicPr>
+                    <pic:cNvPr id="0" name="k11_23_Kc_buyukluk.png"/>
+                    <pic:cNvPicPr/>
+                  </pic:nvPicPr>
+                  <pic:blipFill>
+                    <a:blip r:embed="rId12"/>
+                    <a:stretch>
+                      <a:fillRect/>
+                    </a:stretch>
+                  </pic:blipFill>
+                  <pic:spPr>
+                    <a:xfrm>
+                      <a:off x="0" y="0"/>
+                      <a:ext cx="5400000" cy="2518577"/>
+                    </a:xfrm>
+                    <a:prstGeom prst="rect"/>
+                  </pic:spPr>
+                </pic:pic>
+              </a:graphicData>
+            </a:graphic>
+          </wp:inline>
+        </w:drawing>
+      </w:r>
+    </w:p>
+    <w:p>
+      <w:pPr>
+        <w:jc w:val="center"/>
+      </w:pPr>
+      <w:r>
+        <w:rPr>
+          <w:rFonts w:ascii="Times New Roman" w:hAnsi="Times New Roman" w:cs="Times New Roman"/>
+          <w:b/>
+          <w:lang w:val="tr-TR"/>
+        </w:rPr>
+        <w:t>Görsel D:</w:t>
+      </w:r>
+      <w:r>
+        <w:rPr>
+          <w:rFonts w:ascii="Times New Roman" w:hAnsi="Times New Roman" w:cs="Times New Roman"/>
+          <w:b w:val="0"/>
+          <w:lang w:val="tr-TR"/>
+        </w:rPr>
+        <w:t xml:space="preserve"> Denge sabitinin büyüklüğü ile dengedeki tanecik sayıları arasındaki ilişki</w:t>
       </w:r>
     </w:p>
     <w:tbl>

</xml_diff>

<commit_message>
2.3 giris cift gorseline Shutter onizlemeleri konuldu
</commit_message>
<xml_diff>
--- a/Kim11-2-3-Denge-Sabiti.docx
+++ b/Kim11-2-3-Denge-Sabiti.docx
@@ -69,8 +69,8 @@
             <w:r>
               <w:drawing>
                 <wp:inline xmlns:a="http://schemas.openxmlformats.org/drawingml/2006/main" xmlns:pic="http://schemas.openxmlformats.org/drawingml/2006/picture">
-                  <wp:extent cx="3240000" cy="2160000"/>
-                  <wp:docPr id="910014" name="Picture 910014"/>
+                  <wp:extent cx="2948135" cy="2160000"/>
+                  <wp:docPr id="910016" name="Picture 910016"/>
                   <wp:cNvGraphicFramePr>
                     <a:graphicFrameLocks noChangeAspect="1"/>
                   </wp:cNvGraphicFramePr>
@@ -78,11 +78,11 @@
                     <a:graphicData uri="http://schemas.openxmlformats.org/drawingml/2006/picture">
                       <pic:pic>
                         <pic:nvPicPr>
-                          <pic:cNvPr id="0" name="k11_23_giris_A.png"/>
+                          <pic:cNvPr id="0" name="A2.jpg"/>
                           <pic:cNvPicPr/>
                         </pic:nvPicPr>
                         <pic:blipFill>
-                          <a:blip r:embed="rId14"/>
+                          <a:blip r:embed="rId16"/>
                           <a:stretch>
                             <a:fillRect/>
                           </a:stretch>
@@ -90,7 +90,7 @@
                         <pic:spPr>
                           <a:xfrm>
                             <a:off x="0" y="0"/>
-                            <a:ext cx="3240000" cy="2160000"/>
+                            <a:ext cx="2948135" cy="2160000"/>
                           </a:xfrm>
                           <a:prstGeom prst="rect"/>
                         </pic:spPr>
@@ -113,8 +113,8 @@
             <w:r>
               <w:drawing>
                 <wp:inline xmlns:a="http://schemas.openxmlformats.org/drawingml/2006/main" xmlns:pic="http://schemas.openxmlformats.org/drawingml/2006/picture">
-                  <wp:extent cx="1440000" cy="2160000"/>
-                  <wp:docPr id="910015" name="Picture 910015"/>
+                  <wp:extent cx="1352700" cy="2160000"/>
+                  <wp:docPr id="910017" name="Picture 910017"/>
                   <wp:cNvGraphicFramePr>
                     <a:graphicFrameLocks noChangeAspect="1"/>
                   </wp:cNvGraphicFramePr>
@@ -122,11 +122,11 @@
                     <a:graphicData uri="http://schemas.openxmlformats.org/drawingml/2006/picture">
                       <pic:pic>
                         <pic:nvPicPr>
-                          <pic:cNvPr id="0" name="k11_23_giris_B.png"/>
+                          <pic:cNvPr id="0" name="B2.jpg"/>
                           <pic:cNvPicPr/>
                         </pic:nvPicPr>
                         <pic:blipFill>
-                          <a:blip r:embed="rId15"/>
+                          <a:blip r:embed="rId17"/>
                           <a:stretch>
                             <a:fillRect/>
                           </a:stretch>
@@ -134,7 +134,7 @@
                         <pic:spPr>
                           <a:xfrm>
                             <a:off x="0" y="0"/>
-                            <a:ext cx="1440000" cy="2160000"/>
+                            <a:ext cx="1352700" cy="2160000"/>
                           </a:xfrm>
                           <a:prstGeom prst="rect"/>
                         </pic:spPr>

</xml_diff>